<commit_message>
chore(examples): re-render the Word companion preview
The committed preview was rendered before runs kept their own style, so it
shows the flattening: bold and italic segments carry no run properties and two
accent colours are written as black. The catalogue renders it with them now, and
the drift guard fails on any preview that no longer matches its example.
</commit_message>
<xml_diff>
--- a/assets/readme/examples/word-export-companion.docx
+++ b/assets/readme/examples/word-export-companion.docx
@@ -33,6 +33,7 @@
           <w:rFonts w:ascii="Helvetica" w:hAnsi="Helvetica" w:cs="Helvetica" w:eastAsia="Helvetica"/>
           <w:sz w:val="28"/>
           <w:color w:val="000000"/>
+          <w:b w:val="on"/>
         </w:rPr>
         <w:t>PDF</w:t>
       </w:r>
@@ -49,6 +50,7 @@
           <w:rFonts w:ascii="Helvetica" w:hAnsi="Helvetica" w:cs="Helvetica" w:eastAsia="Helvetica"/>
           <w:sz w:val="28"/>
           <w:color w:val="000000"/>
+          <w:b w:val="on"/>
         </w:rPr>
         <w:t>DOCX</w:t>
       </w:r>
@@ -65,6 +67,7 @@
           <w:rFonts w:ascii="Helvetica" w:hAnsi="Helvetica" w:cs="Helvetica" w:eastAsia="Helvetica"/>
           <w:sz w:val="28"/>
           <w:color w:val="000000"/>
+          <w:i w:val="on"/>
         </w:rPr>
         <w:t xml:space="preserve">italic, </w:t>
       </w:r>
@@ -72,7 +75,7 @@
         <w:rPr>
           <w:rFonts w:ascii="Helvetica" w:hAnsi="Helvetica" w:cs="Helvetica" w:eastAsia="Helvetica"/>
           <w:sz w:val="28"/>
-          <w:color w:val="000000"/>
+          <w:color w:val="C4994C"/>
         </w:rPr>
         <w:t xml:space="preserve">colored, </w:t>
       </w:r>
@@ -80,7 +83,8 @@
         <w:rPr>
           <w:rFonts w:ascii="Helvetica" w:hAnsi="Helvetica" w:cs="Helvetica" w:eastAsia="Helvetica"/>
           <w:sz w:val="28"/>
-          <w:color w:val="000000"/>
+          <w:color w:val="14505F"/>
+          <w:b w:val="on"/>
         </w:rPr>
         <w:t>bold accents</w:t>
       </w:r>

</xml_diff>

<commit_message>
chore(examples): re-render the Word companion after the cell fix
Table-cell paragraphs now carry their alignment and direction, so the
export's bytes moved again.
</commit_message>
<xml_diff>
--- a/assets/readme/examples/word-export-companion.docx
+++ b/assets/readme/examples/word-export-companion.docx
@@ -481,6 +481,9 @@
       <w:tr>
         <w:tc>
           <w:p>
+            <w:pPr>
+              <w:jc w:val="left"/>
+            </w:pPr>
             <w:r>
               <w:rPr>
                 <w:rFonts w:ascii="Helvetica" w:hAnsi="Helvetica" w:cs="Helvetica" w:eastAsia="Helvetica"/>
@@ -494,6 +497,9 @@
         </w:tc>
         <w:tc>
           <w:p>
+            <w:pPr>
+              <w:jc w:val="left"/>
+            </w:pPr>
             <w:r>
               <w:rPr>
                 <w:rFonts w:ascii="Helvetica" w:hAnsi="Helvetica" w:cs="Helvetica" w:eastAsia="Helvetica"/>

</xml_diff>

<commit_message>
chore(examples): re-render the Word companion after the POI switch
POI's own complex-script setters write the properties in a slightly
different shape than the hand-rolled XmlBeans calls did, so the export's
bytes moved once more.
</commit_message>
<xml_diff>
--- a/assets/readme/examples/word-export-companion.docx
+++ b/assets/readme/examples/word-export-companion.docx
@@ -13,7 +13,7 @@
           <w:szCs w:val="40"/>
           <w:color w:val="142D50"/>
           <w:b w:val="on"/>
-          <w:bCs/>
+          <w:bCs w:val="on"/>
         </w:rPr>
         <w:t>GraphCompose → Word, from one document</w:t>
       </w:r>
@@ -38,7 +38,7 @@
           <w:szCs w:val="28"/>
           <w:color w:val="000000"/>
           <w:b w:val="on"/>
-          <w:bCs/>
+          <w:bCs w:val="on"/>
         </w:rPr>
         <w:t>PDF</w:t>
       </w:r>
@@ -58,7 +58,7 @@
           <w:szCs w:val="28"/>
           <w:color w:val="000000"/>
           <w:b w:val="on"/>
-          <w:bCs/>
+          <w:bCs w:val="on"/>
         </w:rPr>
         <w:t>DOCX</w:t>
       </w:r>
@@ -78,7 +78,7 @@
           <w:szCs w:val="28"/>
           <w:color w:val="000000"/>
           <w:i w:val="on"/>
-          <w:iCs/>
+          <w:iCs w:val="on"/>
         </w:rPr>
         <w:t xml:space="preserve">italic, </w:t>
       </w:r>
@@ -98,7 +98,7 @@
           <w:szCs w:val="28"/>
           <w:color w:val="14505F"/>
           <w:b w:val="on"/>
-          <w:bCs/>
+          <w:bCs w:val="on"/>
         </w:rPr>
         <w:t>bold accents</w:t>
       </w:r>
@@ -123,7 +123,7 @@
           <w:szCs w:val="26"/>
           <w:color w:val="222632"/>
           <w:b w:val="on"/>
-          <w:bCs/>
+          <w:bCs w:val="on"/>
         </w:rPr>
         <w:t>Lists keep markers and indent</w:t>
       </w:r>
@@ -194,7 +194,7 @@
           <w:szCs w:val="26"/>
           <w:color w:val="222632"/>
           <w:b w:val="on"/>
-          <w:bCs/>
+          <w:bCs w:val="on"/>
         </w:rPr>
         <w:t>Tables stay tables, and keep their paint</w:t>
       </w:r>
@@ -461,7 +461,7 @@
           <w:szCs w:val="26"/>
           <w:color w:val="222632"/>
           <w:b w:val="on"/>
-          <w:bCs/>
+          <w:bCs w:val="on"/>
         </w:rPr>
         <w:t>Side-by-side rows become one-row tables</w:t>
       </w:r>
@@ -524,7 +524,7 @@
           <w:szCs w:val="26"/>
           <w:color w:val="222632"/>
           <w:b w:val="on"/>
-          <w:bCs/>
+          <w:bCs w:val="on"/>
         </w:rPr>
         <w:t>Images embed at their declared size</w:t>
       </w:r>
@@ -582,7 +582,7 @@
           <w:szCs w:val="26"/>
           <w:color w:val="222632"/>
           <w:b w:val="on"/>
-          <w:bCs/>
+          <w:bCs w:val="on"/>
         </w:rPr>
         <w:t>Charts fall back to their data</w:t>
       </w:r>
@@ -598,7 +598,7 @@
           <w:szCs w:val="20"/>
           <w:color w:val="666A76"/>
           <w:i w:val="on"/>
-          <w:iCs/>
+          <w:iCs w:val="on"/>
         </w:rPr>
         <w:t>The PDF renders the vector chart; Word has no layout pass, so the same node exports as a categories-by-series table.</w:t>
       </w:r>
@@ -742,7 +742,7 @@
           <w:szCs w:val="26"/>
           <w:color w:val="222632"/>
           <w:b w:val="on"/>
-          <w:bCs/>
+          <w:bCs w:val="on"/>
         </w:rPr>
         <w:t>Geometry stays PDF-only by design</w:t>
       </w:r>
@@ -758,7 +758,7 @@
           <w:szCs w:val="20"/>
           <w:color w:val="666A76"/>
           <w:i w:val="on"/>
-          <w:iCs/>
+          <w:iCs w:val="on"/>
         </w:rPr>
         <w:t>The divider and the badge below render in the PDF; the semantic export skips pure geometry and writes the badge's text inline instead.</w:t>
       </w:r>
@@ -774,7 +774,7 @@
           <w:szCs w:val="40"/>
           <w:color w:val="FFFFFF"/>
           <w:b w:val="on"/>
-          <w:bCs/>
+          <w:bCs w:val="on"/>
         </w:rPr>
         <w:t>GC</w:t>
       </w:r>

</xml_diff>